<commit_message>
goyslop in ts commit btw
</commit_message>
<xml_diff>
--- a/chat2_papers/paper/URTC_paper.docx
+++ b/chat2_papers/paper/URTC_paper.docx
@@ -162,7 +162,7 @@
         <w:pStyle w:val="BodyText"/>
       </w:pPr>
       <w:r>
-        <w:t xml:space="preserve">This paper asks that question directly: how reliable is conventional source-domain validation for model selection under real hospital distribution shift, and is there a practical alternative that requires no target labels?</w:t>
+        <w:t xml:space="preserve">This paper asks that question directly: how reliable is conventional source-domain validation for model selection under real hospital distribution shift, and is there a practical alternative that requires no target labels? Answering it requires genuine rather than simulated shift, and a hyperparameter whose choice demonstrably changes deployment performance.</w:t>
       </w:r>
     </w:p>
     <w:p>
@@ -178,7 +178,7 @@
         <w:pStyle w:val="BodyText"/>
       </w:pPr>
       <w:r>
-        <w:t xml:space="preserve">It does not. Our contributions answer the central question in order. First, we show that conventional source-domain validation is unreliable for model selection under hospital distribution shift: across a constraint-weight sweep on three real hospital systems, source validation AUROC varied by roughly one point while target AUROC varied by eleven, and the selected configuration was among the weakest at every external site. Second, we use the PCL study to demonstrate concretely how a seemingly promising cross-hospital improvement disappears once four common evaluation confounds are corrected, each easy to reproduce accidentally. Third, we show empirically that reconstruction error on unlabeled target data is an effective selection criterion, cutting mean selection regret from 0.052 to 0.012. The third result is not a new algorithm; it confirms, in a high-stakes clinical setting and at realistic scale, a phenomenon the domain-adaptation literature has benchmarked in other contexts.</w:t>
+        <w:t xml:space="preserve">That alternative proves unreliable. Our contributions answer the central question in order. First, we show that conventional source-domain validation is unreliable for model selection under hospital distribution shift: across a constraint-weight sweep on three real hospital systems, source validation AUROC varied by roughly one point while target AUROC varied by eleven, and the selected configuration was among the weakest at every external site. Second, we use the PCL study to demonstrate concretely how a seemingly promising cross-hospital improvement disappears once four common evaluation confounds are corrected, each easy to reproduce accidentally. Third, we show empirically that reconstruction error on unlabeled target data is an effective selection criterion, cutting mean selection regret from 0.052 to 0.012. The third result is not a new algorithm; it confirms, in a high-stakes clinical setting and at realistic scale, a phenomenon the domain-adaptation literature has benchmarked in other contexts.</w:t>
       </w:r>
     </w:p>
     <w:p>
@@ -201,13 +201,13 @@
           <wp:inline distT="0" distB="0" distL="0" distR="0">
             <wp:extent cx="2340864" cy="945887"/>
             <wp:effectExtent l="0" t="0" r="0" b="0"/>
-            <wp:docPr id="7866" name="Overview"/>
+            <wp:docPr id="198" name="Overview"/>
             <wp:cNvGraphicFramePr/>
             <a:graphic xmlns:a="http://schemas.openxmlformats.org/drawingml/2006/main">
               <a:graphicData uri="http://schemas.openxmlformats.org/drawingml/2006/picture">
                 <pic:pic xmlns:pic="http://schemas.openxmlformats.org/drawingml/2006/picture">
                   <pic:nvPicPr>
-                    <pic:cNvPr id="7866" name="Overview"/>
+                    <pic:cNvPr id="198" name="Overview"/>
                     <pic:cNvPicPr/>
                   </pic:nvPicPr>
                   <pic:blipFill>
@@ -360,15 +360,7 @@
         <w:pStyle w:val="BodyText"/>
       </w:pPr>
       <w:r>
-        <w:t xml:space="preserve">The separation between sites is strict: every training and selection decision is made on PhysioNet Site A, no target-site data is used during training whether labeled or unlabeled, and target labels are touched only when reporting final numbers.</w:t>
-      </w:r>
-    </w:p>
-    <w:p>
-      <w:pPr>
-        <w:pStyle w:val="BodyText"/>
-      </w:pPr>
-      <w:r>
-        <w:t xml:space="preserve">Table I summarizes the cohorts. Sepsis prevalence differs substantially across systems, which is itself part of the shift being studied.</w:t>
+        <w:t xml:space="preserve">The separation between sites is strict: every training and selection decision is made on PhysioNet Site A, no target-site data is used during training whether labeled or unlabeled, and target labels are touched only when reporting final numbers. Table I summarizes the resulting cohorts. Sepsis prevalence differs substantially across systems, which is itself part of the shift being studied.</w:t>
       </w:r>
     </w:p>
     <w:p>
@@ -1320,15 +1312,15 @@
       <w:r>
         <w:drawing>
           <wp:inline distT="0" distB="0" distL="0" distR="0">
-            <wp:extent cx="2926080" cy="2354788"/>
+            <wp:extent cx="2516429" cy="2025118"/>
             <wp:effectExtent l="0" t="0" r="0" b="0"/>
-            <wp:docPr id="8268" name="ValidationGap"/>
+            <wp:docPr id="4275" name="ValidationGap"/>
             <wp:cNvGraphicFramePr/>
             <a:graphic xmlns:a="http://schemas.openxmlformats.org/drawingml/2006/main">
               <a:graphicData uri="http://schemas.openxmlformats.org/drawingml/2006/picture">
                 <pic:pic xmlns:pic="http://schemas.openxmlformats.org/drawingml/2006/picture">
                   <pic:nvPicPr>
-                    <pic:cNvPr id="8268" name="ValidationGap"/>
+                    <pic:cNvPr id="4275" name="ValidationGap"/>
                     <pic:cNvPicPr/>
                   </pic:nvPicPr>
                   <pic:blipFill>
@@ -1340,7 +1332,7 @@
                   <pic:spPr>
                     <a:xfrm>
                       <a:off x="0" y="0"/>
-                      <a:ext cx="2926080" cy="2354788"/>
+                      <a:ext cx="2516429" cy="2025118"/>
                     </a:xfrm>
                     <a:prstGeom prst="rect">
                       <a:avLst/>
@@ -1854,7 +1846,7 @@
         <w:pStyle w:val="BodyText"/>
       </w:pPr>
       <w:r>
-        <w:t xml:space="preserve">The procedure we would recommend is deliberately unglamorous. Train the candidate configurations as usual. Before deployment, collect unlabeled data from the target hospital, which requires no annotation effort and no clinical review, and run one forward pass per candidate to obtain its masked-reconstruction error on that data. Select the configuration with the lowest error. The cost is a single inference pass per candidate, no additional parameters, and no target labels, and in our experiments it recovered roughly three quarters of the gap between standard practice and oracle selection.</w:t>
+        <w:t xml:space="preserve">The procedure we would recommend is deliberately unglamorous. Train the candidate configurations as usual; before deployment, collect unlabeled data from the target hospital, run one forward pass per candidate to obtain its masked-reconstruction error on that data, and select the configuration with the lowest error. The cost is a single inference pass per candidate, no additional parameters, and no target labels, and in our experiments it recovered roughly three quarters of the gap between standard practice and oracle selection.</w:t>
       </w:r>
     </w:p>
     <w:p>
@@ -1862,7 +1854,7 @@
         <w:pStyle w:val="BodyText"/>
       </w:pPr>
       <w:r>
-        <w:t xml:space="preserve">Adoption depends on when unlabeled target data is available, and the requirement is mild: input channels only, for a modest number of historical stays, with no outcome ascertainment, no chart review, and no labeling. Any hospital preparing to deploy a model already holds such data, and holds it at the point in the timeline where the selection decision is made, which target AUROC by definition is not.</w:t>
+        <w:t xml:space="preserve">Adoption depends on when unlabeled target data is available, and the requirement is mild: input channels only, for a modest number of historical stays, with no outcome ascertainment, no chart review, and no labeling. Any hospital preparing to deploy a model already holds such data, and holds it at the point in the timeline where the selection decision is made.</w:t>
       </w:r>
     </w:p>
     <w:p>
@@ -1870,7 +1862,7 @@
         <w:pStyle w:val="BodyText"/>
       </w:pPr>
       <w:r>
-        <w:t xml:space="preserve">Governance considerations are real but tractable. Patient-level data frequently cannot leave the institution, and the procedure does not require that it does: the computation is forward passes only, so candidate models can be shipped to the hospital and one scalar per candidate returned, with no patient-level data crossing the boundary. What is still required is an agreement permitting on-site execution, and attention to the fact that a returned scalar is a statistic of protected data, however weak. Where even that is not permitted before contracting, the criterion cannot be applied, and our results indicate the fallback should be treated as providing no information rather than a weak signal.</w:t>
+        <w:t xml:space="preserve">Governance considerations are real but tractable. Patient-level data frequently cannot leave the institution, and the procedure does not require that it does: the computation is forward passes only, so candidate models can be shipped to the hospital and one scalar per candidate returned. What is still required is an agreement permitting on-site execution, and attention to the fact that a returned scalar remains a statistic of protected data. Where even that is not permitted before contracting, the criterion cannot be applied, and our results indicate the fallback should be treated as providing no information rather than a weak signal.</w:t>
       </w:r>
     </w:p>
     <w:p>
@@ -1926,7 +1918,7 @@
         <w:pStyle w:val="BodyText"/>
       </w:pPr>
       <w:r>
-        <w:t xml:space="preserve">The authors thank the PhysioNet team and the MIMIC-IV and eICU-CRD Collaborative Research Database maintainers for curating and providing access to the credentialed datasets used in this study.</w:t>
+        <w:t xml:space="preserve">The authors thank the PhysioNet team and the MIMIC-IV and eICU-CRD Collaborative Research Database maintainers for curating and providing access to the credentialed datasets used here.</w:t>
       </w:r>
     </w:p>
     <w:p>

</xml_diff>